<commit_message>
Report name with current date and time, prompt modified for section no
</commit_message>
<xml_diff>
--- a/others/RAG_BTCoreSpec_Output.docx
+++ b/others/RAG_BTCoreSpec_Output.docx
@@ -4,6 +4,9 @@
   <w:body>
     <w:p>
       <w:r>
+        <w:rPr>
+          <w:noProof/>
+        </w:rPr>
         <w:drawing>
           <wp:inline distT="0" distB="0" distL="0" distR="0" wp14:anchorId="426B6600" wp14:editId="480AF8AC">
             <wp:extent cx="6852831" cy="1555667"/>
@@ -43,6 +46,9 @@
     </w:p>
     <w:p>
       <w:r>
+        <w:rPr>
+          <w:noProof/>
+        </w:rPr>
         <w:drawing>
           <wp:inline distT="0" distB="0" distL="0" distR="0" wp14:anchorId="7D5FA722" wp14:editId="1468C453">
             <wp:extent cx="6645910" cy="3799205"/>
@@ -82,6 +88,9 @@
     </w:p>
     <w:p>
       <w:r>
+        <w:rPr>
+          <w:noProof/>
+        </w:rPr>
         <w:drawing>
           <wp:inline distT="0" distB="0" distL="0" distR="0" wp14:anchorId="19C43DD3" wp14:editId="47B451B8">
             <wp:extent cx="6645910" cy="2507615"/>
@@ -121,6 +130,9 @@
     </w:p>
     <w:p>
       <w:r>
+        <w:rPr>
+          <w:noProof/>
+        </w:rPr>
         <w:lastRenderedPageBreak/>
         <w:drawing>
           <wp:inline distT="0" distB="0" distL="0" distR="0" wp14:anchorId="6B2A6801" wp14:editId="06B054E4">
@@ -161,6 +173,9 @@
     </w:p>
     <w:p>
       <w:r>
+        <w:rPr>
+          <w:noProof/>
+        </w:rPr>
         <w:drawing>
           <wp:inline distT="0" distB="0" distL="0" distR="0" wp14:anchorId="20098F54" wp14:editId="4E3E9259">
             <wp:extent cx="6645910" cy="2693035"/>
@@ -201,6 +216,9 @@
     <w:p/>
     <w:p>
       <w:r>
+        <w:rPr>
+          <w:noProof/>
+        </w:rPr>
         <w:drawing>
           <wp:inline distT="0" distB="0" distL="0" distR="0" wp14:anchorId="5E2E1617" wp14:editId="4023AA84">
             <wp:extent cx="6645910" cy="2988945"/>
@@ -240,6 +258,9 @@
     </w:p>
     <w:p>
       <w:r>
+        <w:rPr>
+          <w:noProof/>
+        </w:rPr>
         <w:lastRenderedPageBreak/>
         <w:drawing>
           <wp:inline distT="0" distB="0" distL="0" distR="0" wp14:anchorId="4CAFEB40" wp14:editId="364EF0DA">
@@ -280,6 +301,9 @@
     </w:p>
     <w:p>
       <w:r>
+        <w:rPr>
+          <w:noProof/>
+        </w:rPr>
         <w:drawing>
           <wp:inline distT="0" distB="0" distL="0" distR="0" wp14:anchorId="5ACAF3CD" wp14:editId="5E553E03">
             <wp:extent cx="6645910" cy="2372995"/>
@@ -319,6 +343,9 @@
     </w:p>
     <w:p>
       <w:r>
+        <w:rPr>
+          <w:noProof/>
+        </w:rPr>
         <w:drawing>
           <wp:inline distT="0" distB="0" distL="0" distR="0" wp14:anchorId="1598C789" wp14:editId="7CF02D2F">
             <wp:extent cx="6645910" cy="2857500"/>
@@ -358,6 +385,9 @@
     </w:p>
     <w:p>
       <w:r>
+        <w:rPr>
+          <w:noProof/>
+        </w:rPr>
         <w:lastRenderedPageBreak/>
         <w:drawing>
           <wp:inline distT="0" distB="0" distL="0" distR="0" wp14:anchorId="3A7F6B01" wp14:editId="7ED0A405">
@@ -399,6 +429,9 @@
     <w:p/>
     <w:p>
       <w:r>
+        <w:rPr>
+          <w:noProof/>
+        </w:rPr>
         <w:drawing>
           <wp:inline distT="0" distB="0" distL="0" distR="0" wp14:anchorId="7D17A39C" wp14:editId="142030D1">
             <wp:extent cx="6645910" cy="3623310"/>
@@ -438,6 +471,9 @@
     </w:p>
     <w:p>
       <w:r>
+        <w:rPr>
+          <w:noProof/>
+        </w:rPr>
         <w:lastRenderedPageBreak/>
         <w:drawing>
           <wp:inline distT="0" distB="0" distL="0" distR="0" wp14:anchorId="6EE22459" wp14:editId="68E0F408">
@@ -478,6 +514,9 @@
     </w:p>
     <w:p>
       <w:r>
+        <w:rPr>
+          <w:noProof/>
+        </w:rPr>
         <w:drawing>
           <wp:inline distT="0" distB="0" distL="0" distR="0" wp14:anchorId="0F08619E" wp14:editId="2A853E23">
             <wp:extent cx="6645910" cy="2124075"/>
@@ -515,6 +554,9 @@
         </w:drawing>
       </w:r>
       <w:r>
+        <w:rPr>
+          <w:noProof/>
+        </w:rPr>
         <w:drawing>
           <wp:inline distT="0" distB="0" distL="0" distR="0" wp14:anchorId="3FC810CC" wp14:editId="0ED32DE0">
             <wp:extent cx="6645910" cy="2428240"/>
@@ -554,6 +596,9 @@
     </w:p>
     <w:p>
       <w:r>
+        <w:rPr>
+          <w:noProof/>
+        </w:rPr>
         <w:lastRenderedPageBreak/>
         <w:drawing>
           <wp:inline distT="0" distB="0" distL="0" distR="0" wp14:anchorId="546FB5F8" wp14:editId="7721ED4F">
@@ -593,6 +638,283 @@
       </w:r>
     </w:p>
     <w:p/>
+    <w:p/>
+    <w:p>
+      <w:r>
+        <w:drawing>
+          <wp:inline distT="0" distB="0" distL="0" distR="0" wp14:anchorId="7D6AC34A" wp14:editId="013F40B7">
+            <wp:extent cx="4309607" cy="3274588"/>
+            <wp:effectExtent l="0" t="0" r="0" b="2540"/>
+            <wp:docPr id="522703610" name="Picture 1"/>
+            <wp:cNvGraphicFramePr>
+              <a:graphicFrameLocks xmlns:a="http://schemas.openxmlformats.org/drawingml/2006/main" noChangeAspect="1"/>
+            </wp:cNvGraphicFramePr>
+            <a:graphic xmlns:a="http://schemas.openxmlformats.org/drawingml/2006/main">
+              <a:graphicData uri="http://schemas.openxmlformats.org/drawingml/2006/picture">
+                <pic:pic xmlns:pic="http://schemas.openxmlformats.org/drawingml/2006/picture">
+                  <pic:nvPicPr>
+                    <pic:cNvPr id="522703610" name=""/>
+                    <pic:cNvPicPr/>
+                  </pic:nvPicPr>
+                  <pic:blipFill>
+                    <a:blip r:embed="rId19"/>
+                    <a:stretch>
+                      <a:fillRect/>
+                    </a:stretch>
+                  </pic:blipFill>
+                  <pic:spPr>
+                    <a:xfrm>
+                      <a:off x="0" y="0"/>
+                      <a:ext cx="4316184" cy="3279586"/>
+                    </a:xfrm>
+                    <a:prstGeom prst="rect">
+                      <a:avLst/>
+                    </a:prstGeom>
+                  </pic:spPr>
+                </pic:pic>
+              </a:graphicData>
+            </a:graphic>
+          </wp:inline>
+        </w:drawing>
+      </w:r>
+    </w:p>
+    <w:p/>
+    <w:p>
+      <w:r>
+        <w:drawing>
+          <wp:inline distT="0" distB="0" distL="0" distR="0" wp14:anchorId="69E51E08" wp14:editId="15BE0B8D">
+            <wp:extent cx="4940554" cy="1066855"/>
+            <wp:effectExtent l="0" t="0" r="0" b="0"/>
+            <wp:docPr id="805694281" name="Picture 1"/>
+            <wp:cNvGraphicFramePr>
+              <a:graphicFrameLocks xmlns:a="http://schemas.openxmlformats.org/drawingml/2006/main" noChangeAspect="1"/>
+            </wp:cNvGraphicFramePr>
+            <a:graphic xmlns:a="http://schemas.openxmlformats.org/drawingml/2006/main">
+              <a:graphicData uri="http://schemas.openxmlformats.org/drawingml/2006/picture">
+                <pic:pic xmlns:pic="http://schemas.openxmlformats.org/drawingml/2006/picture">
+                  <pic:nvPicPr>
+                    <pic:cNvPr id="805694281" name=""/>
+                    <pic:cNvPicPr/>
+                  </pic:nvPicPr>
+                  <pic:blipFill>
+                    <a:blip r:embed="rId20"/>
+                    <a:stretch>
+                      <a:fillRect/>
+                    </a:stretch>
+                  </pic:blipFill>
+                  <pic:spPr>
+                    <a:xfrm>
+                      <a:off x="0" y="0"/>
+                      <a:ext cx="4940554" cy="1066855"/>
+                    </a:xfrm>
+                    <a:prstGeom prst="rect">
+                      <a:avLst/>
+                    </a:prstGeom>
+                  </pic:spPr>
+                </pic:pic>
+              </a:graphicData>
+            </a:graphic>
+          </wp:inline>
+        </w:drawing>
+      </w:r>
+    </w:p>
+    <w:p>
+      <w:r>
+        <w:lastRenderedPageBreak/>
+        <w:drawing>
+          <wp:inline distT="0" distB="0" distL="0" distR="0" wp14:anchorId="579C1D86" wp14:editId="3D467D94">
+            <wp:extent cx="6645910" cy="3089910"/>
+            <wp:effectExtent l="0" t="0" r="2540" b="0"/>
+            <wp:docPr id="850167679" name="Picture 1"/>
+            <wp:cNvGraphicFramePr>
+              <a:graphicFrameLocks xmlns:a="http://schemas.openxmlformats.org/drawingml/2006/main" noChangeAspect="1"/>
+            </wp:cNvGraphicFramePr>
+            <a:graphic xmlns:a="http://schemas.openxmlformats.org/drawingml/2006/main">
+              <a:graphicData uri="http://schemas.openxmlformats.org/drawingml/2006/picture">
+                <pic:pic xmlns:pic="http://schemas.openxmlformats.org/drawingml/2006/picture">
+                  <pic:nvPicPr>
+                    <pic:cNvPr id="850167679" name=""/>
+                    <pic:cNvPicPr/>
+                  </pic:nvPicPr>
+                  <pic:blipFill>
+                    <a:blip r:embed="rId21"/>
+                    <a:stretch>
+                      <a:fillRect/>
+                    </a:stretch>
+                  </pic:blipFill>
+                  <pic:spPr>
+                    <a:xfrm>
+                      <a:off x="0" y="0"/>
+                      <a:ext cx="6645910" cy="3089910"/>
+                    </a:xfrm>
+                    <a:prstGeom prst="rect">
+                      <a:avLst/>
+                    </a:prstGeom>
+                  </pic:spPr>
+                </pic:pic>
+              </a:graphicData>
+            </a:graphic>
+          </wp:inline>
+        </w:drawing>
+      </w:r>
+    </w:p>
+    <w:p>
+      <w:r>
+        <w:drawing>
+          <wp:inline distT="0" distB="0" distL="0" distR="0" wp14:anchorId="49C3530D" wp14:editId="655605FE">
+            <wp:extent cx="5035809" cy="3200564"/>
+            <wp:effectExtent l="0" t="0" r="0" b="0"/>
+            <wp:docPr id="731051967" name="Picture 1"/>
+            <wp:cNvGraphicFramePr>
+              <a:graphicFrameLocks xmlns:a="http://schemas.openxmlformats.org/drawingml/2006/main" noChangeAspect="1"/>
+            </wp:cNvGraphicFramePr>
+            <a:graphic xmlns:a="http://schemas.openxmlformats.org/drawingml/2006/main">
+              <a:graphicData uri="http://schemas.openxmlformats.org/drawingml/2006/picture">
+                <pic:pic xmlns:pic="http://schemas.openxmlformats.org/drawingml/2006/picture">
+                  <pic:nvPicPr>
+                    <pic:cNvPr id="731051967" name=""/>
+                    <pic:cNvPicPr/>
+                  </pic:nvPicPr>
+                  <pic:blipFill>
+                    <a:blip r:embed="rId22"/>
+                    <a:stretch>
+                      <a:fillRect/>
+                    </a:stretch>
+                  </pic:blipFill>
+                  <pic:spPr>
+                    <a:xfrm>
+                      <a:off x="0" y="0"/>
+                      <a:ext cx="5035809" cy="3200564"/>
+                    </a:xfrm>
+                    <a:prstGeom prst="rect">
+                      <a:avLst/>
+                    </a:prstGeom>
+                  </pic:spPr>
+                </pic:pic>
+              </a:graphicData>
+            </a:graphic>
+          </wp:inline>
+        </w:drawing>
+      </w:r>
+    </w:p>
+    <w:p>
+      <w:r>
+        <w:drawing>
+          <wp:inline distT="0" distB="0" distL="0" distR="0" wp14:anchorId="6C7E1D47" wp14:editId="3D3618D7">
+            <wp:extent cx="6464632" cy="958899"/>
+            <wp:effectExtent l="0" t="0" r="0" b="0"/>
+            <wp:docPr id="1568515074" name="Picture 1"/>
+            <wp:cNvGraphicFramePr>
+              <a:graphicFrameLocks xmlns:a="http://schemas.openxmlformats.org/drawingml/2006/main" noChangeAspect="1"/>
+            </wp:cNvGraphicFramePr>
+            <a:graphic xmlns:a="http://schemas.openxmlformats.org/drawingml/2006/main">
+              <a:graphicData uri="http://schemas.openxmlformats.org/drawingml/2006/picture">
+                <pic:pic xmlns:pic="http://schemas.openxmlformats.org/drawingml/2006/picture">
+                  <pic:nvPicPr>
+                    <pic:cNvPr id="1568515074" name=""/>
+                    <pic:cNvPicPr/>
+                  </pic:nvPicPr>
+                  <pic:blipFill>
+                    <a:blip r:embed="rId23"/>
+                    <a:stretch>
+                      <a:fillRect/>
+                    </a:stretch>
+                  </pic:blipFill>
+                  <pic:spPr>
+                    <a:xfrm>
+                      <a:off x="0" y="0"/>
+                      <a:ext cx="6464632" cy="958899"/>
+                    </a:xfrm>
+                    <a:prstGeom prst="rect">
+                      <a:avLst/>
+                    </a:prstGeom>
+                  </pic:spPr>
+                </pic:pic>
+              </a:graphicData>
+            </a:graphic>
+          </wp:inline>
+        </w:drawing>
+      </w:r>
+    </w:p>
+    <w:p>
+      <w:r>
+        <w:lastRenderedPageBreak/>
+        <w:drawing>
+          <wp:inline distT="0" distB="0" distL="0" distR="0" wp14:anchorId="7659B082" wp14:editId="4D24A1BF">
+            <wp:extent cx="6645910" cy="3819525"/>
+            <wp:effectExtent l="0" t="0" r="2540" b="9525"/>
+            <wp:docPr id="1865977102" name="Picture 1"/>
+            <wp:cNvGraphicFramePr>
+              <a:graphicFrameLocks xmlns:a="http://schemas.openxmlformats.org/drawingml/2006/main" noChangeAspect="1"/>
+            </wp:cNvGraphicFramePr>
+            <a:graphic xmlns:a="http://schemas.openxmlformats.org/drawingml/2006/main">
+              <a:graphicData uri="http://schemas.openxmlformats.org/drawingml/2006/picture">
+                <pic:pic xmlns:pic="http://schemas.openxmlformats.org/drawingml/2006/picture">
+                  <pic:nvPicPr>
+                    <pic:cNvPr id="1865977102" name=""/>
+                    <pic:cNvPicPr/>
+                  </pic:nvPicPr>
+                  <pic:blipFill>
+                    <a:blip r:embed="rId24"/>
+                    <a:stretch>
+                      <a:fillRect/>
+                    </a:stretch>
+                  </pic:blipFill>
+                  <pic:spPr>
+                    <a:xfrm>
+                      <a:off x="0" y="0"/>
+                      <a:ext cx="6645910" cy="3819525"/>
+                    </a:xfrm>
+                    <a:prstGeom prst="rect">
+                      <a:avLst/>
+                    </a:prstGeom>
+                  </pic:spPr>
+                </pic:pic>
+              </a:graphicData>
+            </a:graphic>
+          </wp:inline>
+        </w:drawing>
+      </w:r>
+    </w:p>
+    <w:p>
+      <w:r>
+        <w:drawing>
+          <wp:inline distT="0" distB="0" distL="0" distR="0" wp14:anchorId="0D8D7DEC" wp14:editId="67889E2C">
+            <wp:extent cx="6645910" cy="3328670"/>
+            <wp:effectExtent l="0" t="0" r="2540" b="5080"/>
+            <wp:docPr id="1254611584" name="Picture 1"/>
+            <wp:cNvGraphicFramePr>
+              <a:graphicFrameLocks xmlns:a="http://schemas.openxmlformats.org/drawingml/2006/main" noChangeAspect="1"/>
+            </wp:cNvGraphicFramePr>
+            <a:graphic xmlns:a="http://schemas.openxmlformats.org/drawingml/2006/main">
+              <a:graphicData uri="http://schemas.openxmlformats.org/drawingml/2006/picture">
+                <pic:pic xmlns:pic="http://schemas.openxmlformats.org/drawingml/2006/picture">
+                  <pic:nvPicPr>
+                    <pic:cNvPr id="1254611584" name=""/>
+                    <pic:cNvPicPr/>
+                  </pic:nvPicPr>
+                  <pic:blipFill>
+                    <a:blip r:embed="rId25"/>
+                    <a:stretch>
+                      <a:fillRect/>
+                    </a:stretch>
+                  </pic:blipFill>
+                  <pic:spPr>
+                    <a:xfrm>
+                      <a:off x="0" y="0"/>
+                      <a:ext cx="6645910" cy="3328670"/>
+                    </a:xfrm>
+                    <a:prstGeom prst="rect">
+                      <a:avLst/>
+                    </a:prstGeom>
+                  </pic:spPr>
+                </pic:pic>
+              </a:graphicData>
+            </a:graphic>
+          </wp:inline>
+        </w:drawing>
+      </w:r>
+    </w:p>
     <w:sectPr>
       <w:pgSz w:w="11906" w:h="16838"/>
       <w:pgMar w:top="720" w:right="720" w:bottom="720" w:left="720" w:header="708" w:footer="708" w:gutter="0"/>

</xml_diff>